<commit_message>
Kill dual-frequency hull plus bone-conduction vagus claim
Search shows audio-tactile crossovers, waterbed/tub dual transducers,
waterproof bone-conduction headphones, and same-actuator auditory vs tactile
frequencies are all prior art. Claiming two frequencies to activate the vagus
also fails Article 25 and the de-environment test. Ingest PAT-PRI-088–091 and
killed PAT-IDEA-060.

Co-authored-by: happyandloveandforever <happyandloveandforever@users.noreply.github.com>
</commit_message>
<xml_diff>
--- a/patent-drafts/漂浮方舟_专利整合方案_v4.0.docx
+++ b/patent-drafts/漂浮方舟_专利整合方案_v4.0.docx
@@ -48,21 +48,21 @@
           <w:rFonts w:ascii="微软雅黑" w:hAnsi="微软雅黑" w:eastAsia="微软雅黑"/>
           <w:b/>
         </w:rPr>
-        <w:t>库现状：196 张卡</w:t>
+        <w:t>库现状：202 张卡</w:t>
       </w:r>
       <w:r>
         <w:rPr>
           <w:rFonts w:ascii="微软雅黑" w:hAnsi="微软雅黑" w:eastAsia="微软雅黑"/>
           <w:b w:val="0"/>
         </w:rPr>
-        <w:t xml:space="preserve"> —— 现行 144、已取代 21、已打掉 18、待重估 13。其中检索到的先案 </w:t>
+        <w:t xml:space="preserve"> —— 现行 149、已取代 21、已打掉 19、待重估 13。其中检索到的先案 </w:t>
       </w:r>
       <w:r>
         <w:rPr>
           <w:rFonts w:ascii="微软雅黑" w:hAnsi="微软雅黑" w:eastAsia="微软雅黑"/>
           <w:b/>
         </w:rPr>
-        <w:t>87 条</w:t>
+        <w:t>91 条</w:t>
       </w:r>
       <w:r>
         <w:rPr>
@@ -70,6 +70,64 @@
           <w:b w:val="0"/>
         </w:rPr>
         <w:t>，本文全部列出。</w:t>
+      </w:r>
+    </w:p>
+    <w:p>
+      <w:pPr>
+        <w:ind w:left="360"/>
+      </w:pPr>
+      <w:r>
+        <w:rPr>
+          <w:rFonts w:ascii="微软雅黑" w:hAnsi="微软雅黑" w:eastAsia="微软雅黑"/>
+          <w:b w:val="0"/>
+          <w:color w:val="555555"/>
+        </w:rPr>
+        <w:t>2026-09-05 补录：</w:t>
+      </w:r>
+      <w:r>
+        <w:rPr>
+          <w:rFonts w:ascii="微软雅黑" w:hAnsi="微软雅黑" w:eastAsia="微软雅黑"/>
+          <w:color w:val="555555"/>
+        </w:rPr>
+        <w:t>PAT-PRI-088</w:t>
+      </w:r>
+      <w:r>
+        <w:rPr>
+          <w:rFonts w:ascii="微软雅黑" w:hAnsi="微软雅黑" w:eastAsia="微软雅黑"/>
+          <w:b w:val="0"/>
+          <w:color w:val="555555"/>
+        </w:rPr>
+        <w:t>～</w:t>
+      </w:r>
+      <w:r>
+        <w:rPr>
+          <w:rFonts w:ascii="微软雅黑" w:hAnsi="微软雅黑" w:eastAsia="微软雅黑"/>
+          <w:color w:val="555555"/>
+        </w:rPr>
+        <w:t>091</w:t>
+      </w:r>
+      <w:r>
+        <w:rPr>
+          <w:rFonts w:ascii="微软雅黑" w:hAnsi="微软雅黑" w:eastAsia="微软雅黑"/>
+          <w:b w:val="0"/>
+          <w:color w:val="555555"/>
+        </w:rPr>
+        <w:t xml:space="preserve"> 与红灯 </w:t>
+      </w:r>
+      <w:r>
+        <w:rPr>
+          <w:rFonts w:ascii="微软雅黑" w:hAnsi="微软雅黑" w:eastAsia="微软雅黑"/>
+          <w:color w:val="555555"/>
+        </w:rPr>
+        <w:t>PAT-IDEA-060</w:t>
+      </w:r>
+      <w:r>
+        <w:rPr>
+          <w:rFonts w:ascii="微软雅黑" w:hAnsi="微软雅黑" w:eastAsia="微软雅黑"/>
+          <w:b w:val="0"/>
+          <w:color w:val="555555"/>
+        </w:rPr>
+        <w:t>（舱壁+骨传导双频激活迷走，已打掉）。不改技术路线。</w:t>
       </w:r>
     </w:p>
     <w:p>
@@ -3227,7 +3285,7 @@
           <w:rFonts w:ascii="微软雅黑" w:hAnsi="微软雅黑" w:eastAsia="微软雅黑"/>
           <w:b w:val="0"/>
         </w:rPr>
-        <w:t>五、全部先案清单（87 条）</w:t>
+        <w:t>五、全部先案清单（91 条）</w:t>
       </w:r>
     </w:p>
     <w:p>
@@ -3934,7 +3992,7 @@
           <w:rFonts w:ascii="微软雅黑" w:hAnsi="微软雅黑" w:eastAsia="微软雅黑"/>
           <w:b w:val="0"/>
         </w:rPr>
-        <w:t>三 声、光、振与低刺激（18 条）</w:t>
+        <w:t>三 声、光、振与低刺激（21 条）</w:t>
       </w:r>
     </w:p>
     <w:tbl>
@@ -4837,6 +4895,147 @@
                 <w:b w:val="0"/>
               </w:rPr>
               <w:t>多感官沉浸舱专利：模块化围合体内设振动换能器向表面传递低频振动供人体感知</w:t>
+            </w:r>
+          </w:p>
+        </w:tc>
+      </w:tr>
+      <w:tr>
+        <w:tc>
+          <w:tcPr>
+            <w:tcW w:type="dxa" w:w="2880"/>
+          </w:tcPr>
+          <w:p>
+            <w:r/>
+            <w:r>
+              <w:rPr>
+                <w:rFonts w:ascii="微软雅黑" w:hAnsi="微软雅黑" w:eastAsia="微软雅黑"/>
+                <w:color w:val="B03060"/>
+              </w:rPr>
+              <w:t>PAT-PRI-088</w:t>
+            </w:r>
+          </w:p>
+        </w:tc>
+        <w:tc>
+          <w:tcPr>
+            <w:tcW w:type="dxa" w:w="2880"/>
+          </w:tcPr>
+          <w:p>
+            <w:r/>
+            <w:r>
+              <w:rPr>
+                <w:rFonts w:ascii="微软雅黑" w:hAnsi="微软雅黑" w:eastAsia="微软雅黑"/>
+                <w:b w:val="0"/>
+              </w:rPr>
+              <w:t>US10206027B2；US10573139B2；US10390139B2</w:t>
+            </w:r>
+          </w:p>
+        </w:tc>
+        <w:tc>
+          <w:tcPr>
+            <w:tcW w:type="dxa" w:w="2880"/>
+          </w:tcPr>
+          <w:p>
+            <w:r/>
+            <w:r>
+              <w:rPr>
+                <w:rFonts w:ascii="微软雅黑" w:hAnsi="微软雅黑" w:eastAsia="微软雅黑"/>
+                <w:b w:val="0"/>
+              </w:rPr>
+              <w:t>低频给触觉振子、中高频给听音单元，是耳机和体感音频里的教科书分频</w:t>
+            </w:r>
+          </w:p>
+        </w:tc>
+      </w:tr>
+      <w:tr>
+        <w:tc>
+          <w:tcPr>
+            <w:tcW w:type="dxa" w:w="2880"/>
+          </w:tcPr>
+          <w:p>
+            <w:r/>
+            <w:r>
+              <w:rPr>
+                <w:rFonts w:ascii="微软雅黑" w:hAnsi="微软雅黑" w:eastAsia="微软雅黑"/>
+                <w:color w:val="B03060"/>
+              </w:rPr>
+              <w:t>PAT-PRI-089</w:t>
+            </w:r>
+          </w:p>
+        </w:tc>
+        <w:tc>
+          <w:tcPr>
+            <w:tcW w:type="dxa" w:w="2880"/>
+          </w:tcPr>
+          <w:p>
+            <w:r/>
+            <w:r>
+              <w:rPr>
+                <w:rFonts w:ascii="微软雅黑" w:hAnsi="微软雅黑" w:eastAsia="微软雅黑"/>
+                <w:b w:val="0"/>
+              </w:rPr>
+              <w:t>US4507816；US4318016；US9314397B2；US9504625B2；US12349798B2；Akva 等体感水床商品</w:t>
+            </w:r>
+          </w:p>
+        </w:tc>
+        <w:tc>
+          <w:tcPr>
+            <w:tcW w:type="dxa" w:w="2880"/>
+          </w:tcPr>
+          <w:p>
+            <w:r/>
+            <w:r>
+              <w:rPr>
+                <w:rFonts w:ascii="微软雅黑" w:hAnsi="微软雅黑" w:eastAsia="微软雅黑"/>
+                <w:b w:val="0"/>
+              </w:rPr>
+              <w:t>水床和体感浴缸早已把「听」和「振」拆成两套换能器，波特性可以不同</w:t>
+            </w:r>
+          </w:p>
+        </w:tc>
+      </w:tr>
+      <w:tr>
+        <w:tc>
+          <w:tcPr>
+            <w:tcW w:type="dxa" w:w="2880"/>
+          </w:tcPr>
+          <w:p>
+            <w:r/>
+            <w:r>
+              <w:rPr>
+                <w:rFonts w:ascii="微软雅黑" w:hAnsi="微软雅黑" w:eastAsia="微软雅黑"/>
+                <w:color w:val="B03060"/>
+              </w:rPr>
+              <w:t>PAT-PRI-090</w:t>
+            </w:r>
+          </w:p>
+        </w:tc>
+        <w:tc>
+          <w:tcPr>
+            <w:tcW w:type="dxa" w:w="2880"/>
+          </w:tcPr>
+          <w:p>
+            <w:r/>
+            <w:r>
+              <w:rPr>
+                <w:rFonts w:ascii="微软雅黑" w:hAnsi="微软雅黑" w:eastAsia="微软雅黑"/>
+                <w:b w:val="0"/>
+              </w:rPr>
+              <w:t>非专利公开：IP68 游泳骨传导耳机商品</w:t>
+            </w:r>
+          </w:p>
+        </w:tc>
+        <w:tc>
+          <w:tcPr>
+            <w:tcW w:type="dxa" w:w="2880"/>
+          </w:tcPr>
+          <w:p>
+            <w:r/>
+            <w:r>
+              <w:rPr>
+                <w:rFonts w:ascii="微软雅黑" w:hAnsi="微软雅黑" w:eastAsia="微软雅黑"/>
+                <w:b w:val="0"/>
+              </w:rPr>
+              <w:t>防水骨传导耳机已按游泳场景公开销售，不能主张漂浮时戴骨传导</w:t>
             </w:r>
           </w:p>
         </w:tc>
@@ -5911,7 +6110,7 @@
           <w:rFonts w:ascii="微软雅黑" w:hAnsi="微软雅黑" w:eastAsia="微软雅黑"/>
           <w:b w:val="0"/>
         </w:rPr>
-        <w:t>五 迷走与生理机制（5 条）</w:t>
+        <w:t>五 迷走与生理机制（6 条）</w:t>
       </w:r>
     </w:p>
     <w:tbl>
@@ -6109,6 +6308,53 @@
                 <w:b w:val="0"/>
               </w:rPr>
               <w:t>迷走刺激可穿戴与漂浮浴槽各自已公开，但两者结合尚未检索到</w:t>
+            </w:r>
+          </w:p>
+        </w:tc>
+      </w:tr>
+      <w:tr>
+        <w:tc>
+          <w:tcPr>
+            <w:tcW w:type="dxa" w:w="2880"/>
+          </w:tcPr>
+          <w:p>
+            <w:r/>
+            <w:r>
+              <w:rPr>
+                <w:rFonts w:ascii="微软雅黑" w:hAnsi="微软雅黑" w:eastAsia="微软雅黑"/>
+                <w:color w:val="B03060"/>
+              </w:rPr>
+              <w:t>PAT-PRI-091</w:t>
+            </w:r>
+          </w:p>
+        </w:tc>
+        <w:tc>
+          <w:tcPr>
+            <w:tcW w:type="dxa" w:w="2880"/>
+          </w:tcPr>
+          <w:p>
+            <w:r/>
+            <w:r>
+              <w:rPr>
+                <w:rFonts w:ascii="微软雅黑" w:hAnsi="微软雅黑" w:eastAsia="微软雅黑"/>
+                <w:b w:val="0"/>
+              </w:rPr>
+              <w:t>US11818543B2</w:t>
+            </w:r>
+          </w:p>
+        </w:tc>
+        <w:tc>
+          <w:tcPr>
+            <w:tcW w:type="dxa" w:w="2880"/>
+          </w:tcPr>
+          <w:p>
+            <w:r/>
+            <w:r>
+              <w:rPr>
+                <w:rFonts w:ascii="微软雅黑" w:hAnsi="微软雅黑" w:eastAsia="微软雅黑"/>
+                <w:b w:val="0"/>
+              </w:rPr>
+              <w:t>同一骨传导作动器上，听觉振动和触觉振动可以用不同频率、不同增益同时给</w:t>
             </w:r>
           </w:p>
         </w:tc>
@@ -7773,7 +8019,7 @@
           <w:rFonts w:ascii="微软雅黑" w:hAnsi="微软雅黑" w:eastAsia="微软雅黑"/>
           <w:b w:val="0"/>
         </w:rPr>
-        <w:t>六、全部红灯（18 条）</w:t>
+        <w:t>六、全部红灯（19 条）</w:t>
       </w:r>
     </w:p>
     <w:p>
@@ -8926,6 +9172,109 @@
                 <w:color w:val="B03060"/>
               </w:rPr>
               <w:t>PAT-PRI-084</w:t>
+            </w:r>
+          </w:p>
+        </w:tc>
+      </w:tr>
+      <w:tr>
+        <w:tc>
+          <w:tcPr>
+            <w:tcW w:type="dxa" w:w="2880"/>
+          </w:tcPr>
+          <w:p>
+            <w:r/>
+            <w:r>
+              <w:rPr>
+                <w:rFonts w:ascii="微软雅黑" w:hAnsi="微软雅黑" w:eastAsia="微软雅黑"/>
+                <w:color w:val="B03060"/>
+              </w:rPr>
+              <w:t>PAT-IDEA-060</w:t>
+            </w:r>
+          </w:p>
+        </w:tc>
+        <w:tc>
+          <w:tcPr>
+            <w:tcW w:type="dxa" w:w="2880"/>
+          </w:tcPr>
+          <w:p>
+            <w:r/>
+            <w:r>
+              <w:rPr>
+                <w:rFonts w:ascii="微软雅黑" w:hAnsi="微软雅黑" w:eastAsia="微软雅黑"/>
+                <w:b w:val="0"/>
+              </w:rPr>
+              <w:t>舱体一体频打躯体、骨传导耳机一头频打头部，合起来激活迷走</w:t>
+            </w:r>
+          </w:p>
+        </w:tc>
+        <w:tc>
+          <w:tcPr>
+            <w:tcW w:type="dxa" w:w="2880"/>
+          </w:tcPr>
+          <w:p>
+            <w:r/>
+            <w:r>
+              <w:rPr>
+                <w:rFonts w:ascii="微软雅黑" w:hAnsi="微软雅黑" w:eastAsia="微软雅黑"/>
+                <w:color w:val="B03060"/>
+              </w:rPr>
+              <w:t>PAT-PRI-088</w:t>
+            </w:r>
+            <w:r>
+              <w:rPr>
+                <w:rFonts w:ascii="微软雅黑" w:hAnsi="微软雅黑" w:eastAsia="微软雅黑"/>
+                <w:b w:val="0"/>
+              </w:rPr>
+              <w:t>～</w:t>
+            </w:r>
+            <w:r>
+              <w:rPr>
+                <w:rFonts w:ascii="微软雅黑" w:hAnsi="微软雅黑" w:eastAsia="微软雅黑"/>
+                <w:color w:val="B03060"/>
+              </w:rPr>
+              <w:t>091</w:t>
+            </w:r>
+            <w:r>
+              <w:rPr>
+                <w:rFonts w:ascii="微软雅黑" w:hAnsi="微软雅黑" w:eastAsia="微软雅黑"/>
+                <w:b w:val="0"/>
+              </w:rPr>
+              <w:t>、</w:t>
+            </w:r>
+            <w:r>
+              <w:rPr>
+                <w:rFonts w:ascii="微软雅黑" w:hAnsi="微软雅黑" w:eastAsia="微软雅黑"/>
+                <w:color w:val="B03060"/>
+              </w:rPr>
+              <w:t>PAT-PRI-080</w:t>
+            </w:r>
+            <w:r>
+              <w:rPr>
+                <w:rFonts w:ascii="微软雅黑" w:hAnsi="微软雅黑" w:eastAsia="微软雅黑"/>
+                <w:b w:val="0"/>
+              </w:rPr>
+              <w:t>、</w:t>
+            </w:r>
+            <w:r>
+              <w:rPr>
+                <w:rFonts w:ascii="微软雅黑" w:hAnsi="微软雅黑" w:eastAsia="微软雅黑"/>
+                <w:color w:val="B03060"/>
+              </w:rPr>
+              <w:t>081</w:t>
+            </w:r>
+            <w:r>
+              <w:rPr>
+                <w:rFonts w:ascii="微软雅黑" w:hAnsi="微软雅黑" w:eastAsia="微软雅黑"/>
+                <w:b w:val="0"/>
+              </w:rPr>
+              <w:t>、</w:t>
+            </w:r>
+            <w:r>
+              <w:rPr>
+                <w:rFonts w:ascii="微软雅黑" w:hAnsi="微软雅黑" w:eastAsia="微软雅黑"/>
+                <w:color w:val="B03060"/>
+              </w:rPr>
+              <w:t>030</w:t>
             </w:r>
           </w:p>
         </w:tc>
@@ -9109,7 +9458,7 @@
           <w:rFonts w:ascii="微软雅黑" w:hAnsi="微软雅黑" w:eastAsia="微软雅黑"/>
           <w:b w:val="0"/>
         </w:rPr>
-        <w:t>不得主张：AOP、光触媒、舱内触觉换能器、骨传导放松、抗结晶涂层、调光材料、掩蔽声、被动隔声——这些一律写进前序部分当现有技术。</w:t>
+        <w:t>不得主张：AOP、光触媒、舱内触觉换能器、骨传导放松、抗结晶涂层、调光材料、掩蔽声、被动隔声、两路频率分别打躯体和头部以激活迷走——这些一律写进前序部分当现有技术。</w:t>
       </w:r>
     </w:p>
     <w:p>
@@ -9276,6 +9625,59 @@
           <w:b w:val="0"/>
         </w:rPr>
         <w:t xml:space="preserve"> 说得出，剩下六步交给流水线。</w:t>
+      </w:r>
+    </w:p>
+    <w:p/>
+    <w:p>
+      <w:pPr>
+        <w:pStyle w:val="Heading2"/>
+      </w:pPr>
+      <w:r>
+        <w:rPr>
+          <w:rFonts w:ascii="微软雅黑" w:hAnsi="微软雅黑" w:eastAsia="微软雅黑"/>
+          <w:b w:val="0"/>
+        </w:rPr>
+        <w:t>附：2026-09-05 补录（双通道迷走）</w:t>
+      </w:r>
+    </w:p>
+    <w:p>
+      <w:pPr>
+        <w:jc w:val="left"/>
+      </w:pPr>
+      <w:r>
+        <w:rPr>
+          <w:rFonts w:ascii="微软雅黑" w:hAnsi="微软雅黑" w:eastAsia="微软雅黑"/>
+          <w:b w:val="0"/>
+        </w:rPr>
+        <w:t>定稿后有人提出：舱壁一个频率打躯体，骨传导耳机另一个频率打头部，合起来激活迷走。评估结论已打掉（</w:t>
+      </w:r>
+      <w:r>
+        <w:rPr>
+          <w:rFonts w:ascii="微软雅黑" w:hAnsi="微软雅黑" w:eastAsia="微软雅黑"/>
+          <w:color w:val="B03060"/>
+        </w:rPr>
+        <w:t>PAT-IDEA-060</w:t>
+      </w:r>
+      <w:r>
+        <w:rPr>
+          <w:rFonts w:ascii="微软雅黑" w:hAnsi="微软雅黑" w:eastAsia="微软雅黑"/>
+          <w:b w:val="0"/>
+        </w:rPr>
+        <w:t xml:space="preserve">）。产品可以做双通道微振，专利不写这个效果。源稿 </w:t>
+      </w:r>
+      <w:r>
+        <w:rPr>
+          <w:rFonts w:ascii="微软雅黑" w:hAnsi="微软雅黑" w:eastAsia="微软雅黑"/>
+          <w:color w:val="B03060"/>
+        </w:rPr>
+        <w:t>patent-drafts/双通道体头振动-检索评估.md</w:t>
+      </w:r>
+      <w:r>
+        <w:rPr>
+          <w:rFonts w:ascii="微软雅黑" w:hAnsi="微软雅黑" w:eastAsia="微软雅黑"/>
+          <w:b w:val="0"/>
+        </w:rPr>
+        <w:t>。</w:t>
       </w:r>
     </w:p>
     <w:sectPr>

</xml_diff>